<commit_message>
Ledgerline approved design: encryption is baseline, not an improvement
Regenerated the approved improvement Solution Design (docx + reprinted pdf) — CL3 is an infrastructure-improvement exercise on an imaginary system with an empty, encrypted database; encryption-at-rest is part of the baseline, so the database/storage security improvements are the in-place hardening (least-privilege, Secrets Manager, TLS, Block Public Access, flow logs).

Co-Authored-By: Claude Opus 4.8 <noreply@anthropic.com>
</commit_message>
<xml_diff>
--- a/public/documents/YAT-Accounting-Improved-Solution-Design.docx
+++ b/public/documents/YAT-Accounting-Improved-Solution-Design.docx
@@ -1190,7 +1190,7 @@
               <w:rPr>
                 <w:sz w:val="18"/>
               </w:rPr>
-              <w:t>Internal-only (VPN), security groups in place; patching/role/encryption posture not hardened</w:t>
+              <w:t>Internal-only (VPN), encrypted at rest, security groups in place; patching/role posture not hardened</w:t>
             </w:r>
           </w:p>
         </w:tc>
@@ -1209,7 +1209,7 @@
               <w:rPr>
                 <w:sz w:val="18"/>
               </w:rPr>
-              <w:t>Tighten least-privilege, encryption at rest, managed patching and secrets</w:t>
+              <w:t>Tighten least-privilege, managed patching, secrets and TLS (encryption at rest is already in the baseline)</w:t>
             </w:r>
           </w:p>
         </w:tc>
@@ -1579,7 +1579,7 @@
               <w:rPr>
                 <w:sz w:val="18"/>
               </w:rPr>
-              <w:t>Least-privilege, encrypted, managed-patch posture</w:t>
+              <w:t>Least-privilege, secrets-managed, managed-patch posture (baseline already encrypted at rest)</w:t>
             </w:r>
           </w:p>
         </w:tc>
@@ -1598,7 +1598,7 @@
               <w:rPr>
                 <w:sz w:val="18"/>
               </w:rPr>
-              <w:t>0 plaintext secrets; 100% volumes/buckets encrypted; patch compliance reported</w:t>
+              <w:t>0 plaintext secrets; managed-patch compliance reported; least-privilege roles/SGs in place</w:t>
             </w:r>
           </w:p>
         </w:tc>
@@ -2513,7 +2513,7 @@
               <w:rPr>
                 <w:sz w:val="18"/>
               </w:rPr>
-              <w:t>Encryption at rest (KMS) and in transit; credentials in Secrets Manager with rotation; security group restricting access to the app tier; not publicly accessible</w:t>
+              <w:t>Encryption in transit (TLS); credentials in Secrets Manager with rotation; security group restricting access to the app tier; not publicly accessible (encryption at rest is already enabled in the baseline)</w:t>
             </w:r>
           </w:p>
         </w:tc>
@@ -2743,7 +2743,7 @@
               <w:rPr>
                 <w:sz w:val="18"/>
               </w:rPr>
-              <w:t>SSE-KMS on all buckets and volumes; S3 Block Public Access; bucket policies; S3 access logging</w:t>
+              <w:t>S3 Block Public Access; bucket policies; S3 access logging (encryption at rest is already enabled in the baseline)</w:t>
             </w:r>
           </w:p>
         </w:tc>

</xml_diff>